<commit_message>
Update activity builder response spacing and template mapping
</commit_message>
<xml_diff>
--- a/template_atividade.docx
+++ b/template_atividade.docx
@@ -278,6 +278,43 @@
                       <w:szCs w:val="18"/>
                     </w:rPr>
                     <w:t xml:space="preserve">    COMPONENTE CURRICULAR: </w:t>
+                  </w:r>
+                </w:p>
+                <w:p>
+                  <w:pPr>
+                    <w:widowControl w:val="0"/>
+                    <w:pBdr>
+                      <w:top w:val="nil"/>
+                      <w:left w:val="nil"/>
+                      <w:bottom w:val="nil"/>
+                      <w:right w:val="nil"/>
+                      <w:between w:val="nil"/>
+                    </w:pBdr>
+                    <w:spacing w:after="0" w:line="240" w:lineRule="auto"/>
+                    <w:ind w:left="-810" w:firstLine="668"/>
+                    <w:rPr>
+                      <w:rFonts w:ascii="Arial" w:hAnsi="Arial" w:cs="Arial"/>
+                      <w:sz w:val="18"/>
+                      <w:szCs w:val="18"/>
+                    </w:rPr>
+                  </w:pPr>
+                  <w:r>
+                    <w:rPr>
+                      <w:rFonts w:ascii="Arial" w:hAnsi="Arial" w:cs="Arial"/>
+                      <w:b/>
+                      <w:bCs/>
+                      <w:sz w:val="18"/>
+                      <w:szCs w:val="18"/>
+                    </w:rPr>
+                    <w:t xml:space="preserve">     </w:t>
+                  </w:r>
+                  <w:r>
+                    <w:rPr>
+                      <w:rFonts w:ascii="Arial" w:hAnsi="Arial" w:cs="Arial"/>
+                      <w:sz w:val="16"/>
+                      <w:szCs w:val="16"/>
+                    </w:rPr>
+                    <w:t>&lt;&lt;Componente&gt;&gt;</w:t>
                   </w:r>
                 </w:p>
               </w:tc>

</xml_diff>